<commit_message>
Update demo scripts for pipeline automation capabilities
- Module 3 (Open Lakehouse): Pipelines-as-Code segment now covers both
  deployment paths — manual zip import (npm run pipeline:zip) and the
  fully automated REST chain (connections, import, bindings, prepare,
  task start in dependency order) — plus the daily YAML schedules
  (silver 05:30 UTC, gold 06:00 UTC) and the deploy UI toggles
- Module 5 (Data Products): automation note that the deploy provisions
  all 7 products, attaches gold catalog datasets after the first
  pipeline run, and can activate products to the marketplace
- Regenerated all 13 demo script documents

Co-Authored-By: Claude Fable 5 <noreply@anthropic.com>
</commit_message>
<xml_diff>
--- a/documents/demo-scripts/03_Open_Lakehouse.docx
+++ b/documents/demo-scripts/03_Open_Lakehouse.docx
@@ -3548,7 +3548,7 @@
           <w:sz w:val="21"/>
           <w:szCs w:val="21"/>
         </w:rPr>
-        <w:t xml:space="preserve">Highlight refresh schedules: real-time CDC, 5-min streaming, 15-min batch</w:t>
+        <w:t xml:space="preserve">Highlight refresh schedules: real-time CDC, 5-min streaming, 15-min batch, plus daily silver/gold full refresh (05:30 / 06:00 UTC)</w:t>
       </w:r>
     </w:p>
     <w:p>
@@ -3583,7 +3583,7 @@
           <w:sz w:val="21"/>
           <w:szCs w:val="21"/>
         </w:rPr>
-        <w:t xml:space="preserve">The entire pipeline you just saw — landing tasks, transformations, schedules, and bindings — is also defined as version-controlled YAML in deploy/pipelines/mcg-pipeline/. This is the declarative pipelines capability (QTCP preview): the whole project can be rebuilt on any tenant from the repo.</w:t>
+        <w:t xml:space="preserve">The entire pipeline you just saw — landing tasks, transformations, daily schedules, and bindings — is also defined as version-controlled YAML in deploy/pipelines/mcg-pipeline/. This is the declarative pipelines capability (QTCP preview): the whole project can be rebuilt on any tenant from the repo.</w:t>
       </w:r>
     </w:p>
     <w:p>
@@ -3611,7 +3611,7 @@
           <w:sz w:val="21"/>
           <w:szCs w:val="21"/>
         </w:rPr>
-        <w:t xml:space="preserve">Show the YAML project in VS Code: qtcp_project.yaml, one folder per task, datasets with custom SQL</w:t>
+        <w:t xml:space="preserve">Show the YAML project in VS Code: qtcp_project.yaml, one folder per task, datasets with custom SQL, and schedule.yaml files carrying daily RRULEs (silver 05:30 UTC, gold 06:00 UTC) alongside event-based cascade triggers</w:t>
       </w:r>
     </w:p>
     <w:p>
@@ -3639,7 +3639,7 @@
           <w:sz w:val="21"/>
           <w:szCs w:val="21"/>
         </w:rPr>
-        <w:t xml:space="preserve">Build the import package:</w:t>
+        <w:t xml:space="preserve">Manual path — build the import package, then in Qlik Cloud: Data Integration &gt; your project &gt; Import:</w:t>
       </w:r>
     </w:p>
     <w:tbl>
@@ -3752,7 +3752,120 @@
           <w:sz w:val="21"/>
           <w:szCs w:val="21"/>
         </w:rPr>
-        <w:t xml:space="preserve">In Qlik Cloud: Data Integration &gt; your project &gt; Import — select the generated mcg-pipeline.zip</w:t>
+        <w:t xml:space="preserve">Automated path — the deploy script drives the whole chain over REST APIs: create connections, import definitions, resolve bindings, prepare, then start every task in dependency order (landing &gt; transform &gt; datamart):</w:t>
+      </w:r>
+    </w:p>
+    <w:tbl>
+      <w:tblPr>
+        <w:tblW w:type="pct" w:w="100%"/>
+        <w:tblBorders>
+          <w:top w:val="single" w:color="auto" w:sz="4"/>
+          <w:left w:val="single" w:color="auto" w:sz="4"/>
+          <w:bottom w:val="single" w:color="auto" w:sz="4"/>
+          <w:right w:val="single" w:color="auto" w:sz="4"/>
+          <w:insideH w:val="single" w:color="auto" w:sz="4"/>
+          <w:insideV w:val="single" w:color="auto" w:sz="4"/>
+        </w:tblBorders>
+      </w:tblPr>
+      <w:tblGrid>
+        <w:gridCol w:w="100"/>
+        <w:gridCol w:w="100"/>
+      </w:tblGrid>
+      <w:tr>
+        <w:tc>
+          <w:tcPr>
+            <w:tcW w:type="pct" w:w="2%"/>
+            <w:tcBorders>
+              <w:top w:val="none"/>
+              <w:left w:val="none"/>
+              <w:bottom w:val="none"/>
+              <w:right w:val="none"/>
+            </w:tcBorders>
+            <w:shd w:color="006580" w:val="solid"/>
+          </w:tcPr>
+          <w:p>
+            <w:pPr>
+              <w:spacing w:after="0"/>
+            </w:pPr>
+            <w:r>
+              <w:rPr>
+                <w:sz w:val="10"/>
+                <w:szCs w:val="10"/>
+              </w:rPr>
+              <w:t xml:space="preserve"> </w:t>
+            </w:r>
+          </w:p>
+        </w:tc>
+        <w:tc>
+          <w:tcPr>
+            <w:tcW w:type="pct" w:w="98%"/>
+            <w:shd w:color="E0F2F5" w:val="solid"/>
+            <w:tcMar>
+              <w:top w:type="dxa" w:w="60"/>
+              <w:left w:type="dxa" w:w="120"/>
+              <w:bottom w:type="dxa" w:w="60"/>
+              <w:right w:type="dxa" w:w="120"/>
+            </w:tcMar>
+          </w:tcPr>
+          <w:p>
+            <w:pPr>
+              <w:spacing w:after="40"/>
+            </w:pPr>
+            <w:r>
+              <w:rPr>
+                <w:rFonts w:ascii="Inter" w:cs="Inter" w:eastAsia="Inter" w:hAnsi="Inter"/>
+                <w:b/>
+                <w:bCs/>
+                <w:color w:val="006580"/>
+                <w:sz w:val="18"/>
+                <w:szCs w:val="18"/>
+              </w:rPr>
+              <w:t xml:space="preserve">Terminal Command (with pipelines.prepare + pipelines.run enabled)</w:t>
+            </w:r>
+          </w:p>
+          <w:p>
+            <w:pPr>
+              <w:spacing w:after="0"/>
+            </w:pPr>
+            <w:r>
+              <w:rPr>
+                <w:rFonts w:ascii="Consolas" w:cs="Consolas" w:eastAsia="Consolas" w:hAnsi="Consolas"/>
+                <w:color w:val="454659"/>
+                <w:sz w:val="20"/>
+                <w:szCs w:val="20"/>
+              </w:rPr>
+              <w:t xml:space="preserve">npm run deploy</w:t>
+            </w:r>
+          </w:p>
+        </w:tc>
+      </w:tr>
+    </w:tbl>
+    <w:p>
+      <w:pPr>
+        <w:spacing w:after="80"/>
+        <w:ind w:left="431"/>
+      </w:pPr>
+      <w:r>
+        <w:rPr>
+          <w:rFonts w:ascii="Inter" w:cs="Inter" w:eastAsia="Inter" w:hAnsi="Inter"/>
+          <w:b/>
+          <w:bCs/>
+          <w:color w:val="006580"/>
+          <w:sz w:val="21"/>
+          <w:szCs w:val="21"/>
+        </w:rPr>
+        <w:t xml:space="preserve">4. </w:t>
+      </w:r>
+      <w:r>
+        <w:rPr>
+          <w:rFonts w:ascii="Inter" w:cs="Inter" w:eastAsia="Inter" w:hAnsi="Inter"/>
+          <w:b w:val="false"/>
+          <w:bCs w:val="false"/>
+          <w:color w:val="454659"/>
+          <w:sz w:val="21"/>
+          <w:szCs w:val="21"/>
+        </w:rPr>
+        <w:t xml:space="preserve">Show the deploy web UI toggles on the pipeline page: Prepare, Start tasks, Attach gold datasets to Data Products, Publish to marketplace</w:t>
       </w:r>
     </w:p>
     <w:p>
@@ -3769,7 +3882,7 @@
           <w:sz w:val="21"/>
           <w:szCs w:val="21"/>
         </w:rPr>
-        <w:t xml:space="preserve">4. </w:t>
+        <w:t xml:space="preserve">5. </w:t>
       </w:r>
       <w:r>
         <w:rPr>
@@ -3846,7 +3959,7 @@
                 <w:sz w:val="20"/>
                 <w:szCs w:val="20"/>
               </w:rPr>
-              <w:t xml:space="preserve">Talking point: Pipelines as code means the medallion architecture is reproducible, reviewable, and versioned. A new tenant goes from empty to a full bronze/silver/gold pipeline in minutes — and every transformation change has a git history. AI assistants can author and validate the YAML directly against the published schemas.</w:t>
+              <w:t xml:space="preserve">Talking point: Pipelines as code means the medallion architecture is reproducible, reviewable, and versioned. A new tenant goes from empty to a full, running, daily-scheduled bronze/silver/gold pipeline in minutes — and every transformation change has a git history. After the first run, the deploy attaches the gold catalog datasets to their Data Products automatically (Module 5 shows the result). AI assistants can author and validate the YAML directly against the published schemas.</w:t>
             </w:r>
           </w:p>
         </w:tc>

</xml_diff>